<commit_message>
Additional QOL to refresh the format of the dgv on form resize
</commit_message>
<xml_diff>
--- a/Activity6/CST-250 Activity6_ChadGalloway.docx
+++ b/Activity6/CST-250 Activity6_ChadGalloway.docx
@@ -239,6 +239,14 @@
           <w:szCs w:val="28"/>
         </w:rPr>
         <w:t>Part 1</w:t>
+      </w:r>
+      <w:r>
+        <w:rPr>
+          <w:b/>
+          <w:sz w:val="28"/>
+          <w:szCs w:val="28"/>
+        </w:rPr>
+        <w:t>: Creating the UI</w:t>
       </w:r>
     </w:p>
     <w:p>
@@ -1350,15 +1358,33 @@
     <w:p>
       <w:pPr>
         <w:jc w:val="center"/>
-      </w:pPr>
-      <w:r>
         <w:rPr>
           <w:b/>
           <w:sz w:val="28"/>
           <w:szCs w:val="28"/>
         </w:rPr>
+      </w:pPr>
+      <w:r>
+        <w:rPr>
+          <w:b/>
+          <w:sz w:val="28"/>
+          <w:szCs w:val="28"/>
+        </w:rPr>
         <w:t>Part 2</w:t>
       </w:r>
+      <w:r>
+        <w:rPr>
+          <w:b/>
+          <w:sz w:val="28"/>
+          <w:szCs w:val="28"/>
+        </w:rPr>
+        <w:t>: File I/O</w:t>
+      </w:r>
+    </w:p>
+    <w:p>
+      <w:pPr>
+        <w:jc w:val="center"/>
+      </w:pPr>
     </w:p>
     <w:p>
       <w:pPr>
@@ -2369,69 +2395,6 @@
     </w:p>
     <w:p/>
     <w:p>
-      <w:pPr>
-        <w:jc w:val="center"/>
-      </w:pPr>
-      <w:r>
-        <w:rPr>
-          <w:noProof/>
-        </w:rPr>
-        <w:lastRenderedPageBreak/>
-        <w:drawing>
-          <wp:inline distT="114300" distB="114300" distL="114300" distR="114300" wp14:anchorId="5C5D5F4F" wp14:editId="051E5110">
-            <wp:extent cx="5943600" cy="4873752"/>
-            <wp:effectExtent l="0" t="0" r="0" b="3175"/>
-            <wp:docPr id="1826176038" name="image1.jpg"/>
-            <wp:cNvGraphicFramePr>
-              <a:graphicFrameLocks xmlns:a="http://schemas.openxmlformats.org/drawingml/2006/main" noChangeAspect="1"/>
-            </wp:cNvGraphicFramePr>
-            <a:graphic xmlns:a="http://schemas.openxmlformats.org/drawingml/2006/main">
-              <a:graphicData uri="http://schemas.openxmlformats.org/drawingml/2006/picture">
-                <pic:pic xmlns:pic="http://schemas.openxmlformats.org/drawingml/2006/picture">
-                  <pic:nvPicPr>
-                    <pic:cNvPr id="1004731626" name="image1.jpg"/>
-                    <pic:cNvPicPr/>
-                  </pic:nvPicPr>
-                  <pic:blipFill>
-                    <a:blip r:embed="rId19" cstate="print">
-                      <a:extLst>
-                        <a:ext uri="{28A0092B-C50C-407E-A947-70E740481C1C}">
-                          <a14:useLocalDpi xmlns:a14="http://schemas.microsoft.com/office/drawing/2010/main" val="0"/>
-                        </a:ext>
-                      </a:extLst>
-                    </a:blip>
-                    <a:stretch>
-                      <a:fillRect/>
-                    </a:stretch>
-                  </pic:blipFill>
-                  <pic:spPr>
-                    <a:xfrm>
-                      <a:off x="0" y="0"/>
-                      <a:ext cx="5943600" cy="4873752"/>
-                    </a:xfrm>
-                    <a:prstGeom prst="rect">
-                      <a:avLst/>
-                    </a:prstGeom>
-                    <a:ln/>
-                  </pic:spPr>
-                </pic:pic>
-              </a:graphicData>
-            </a:graphic>
-          </wp:inline>
-        </w:drawing>
-      </w:r>
-    </w:p>
-    <w:p>
-      <w:pPr>
-        <w:jc w:val="center"/>
-      </w:pPr>
-      <w:r>
-        <w:t>Figure X: Screenshot of Error Handling</w:t>
-      </w:r>
-    </w:p>
-    <w:p/>
-    <w:p/>
-    <w:p>
       <w:r>
         <w:br w:type="page"/>
       </w:r>
@@ -2462,233 +2425,29 @@
         </w:rPr>
         <w:t>3</w:t>
       </w:r>
-    </w:p>
-    <w:p>
-      <w:pPr>
-        <w:rPr>
-          <w:lang w:val="en-US"/>
-        </w:rPr>
-      </w:pPr>
-    </w:p>
-    <w:p>
-      <w:pPr>
-        <w:jc w:val="center"/>
-        <w:rPr>
+      <w:r>
+        <w:rPr>
+          <w:b/>
           <w:sz w:val="28"/>
           <w:szCs w:val="28"/>
         </w:rPr>
-      </w:pPr>
-      <w:r>
+        <w:t>: Filter and Sort</w:t>
+      </w:r>
+    </w:p>
+    <w:p/>
+    <w:p>
+      <w:pPr>
+        <w:jc w:val="center"/>
         <w:rPr>
           <w:sz w:val="28"/>
           <w:szCs w:val="28"/>
         </w:rPr>
-        <w:t>FLOW CHART</w:t>
-      </w:r>
-    </w:p>
-    <w:p>
-      <w:pPr>
-        <w:jc w:val="center"/>
+      </w:pPr>
+      <w:r>
         <w:rPr>
           <w:sz w:val="28"/>
           <w:szCs w:val="28"/>
         </w:rPr>
-      </w:pPr>
-    </w:p>
-    <w:p>
-      <w:pPr>
-        <w:jc w:val="center"/>
-      </w:pPr>
-      <w:r>
-        <w:rPr>
-          <w:noProof/>
-        </w:rPr>
-        <w:drawing>
-          <wp:inline distT="114300" distB="114300" distL="114300" distR="114300" wp14:anchorId="5F451F99" wp14:editId="79DA2C96">
-            <wp:extent cx="3148013" cy="1796373"/>
-            <wp:effectExtent l="0" t="0" r="0" b="0"/>
-            <wp:docPr id="905574333" name="image1.jpg"/>
-            <wp:cNvGraphicFramePr/>
-            <a:graphic xmlns:a="http://schemas.openxmlformats.org/drawingml/2006/main">
-              <a:graphicData uri="http://schemas.openxmlformats.org/drawingml/2006/picture">
-                <pic:pic xmlns:pic="http://schemas.openxmlformats.org/drawingml/2006/picture">
-                  <pic:nvPicPr>
-                    <pic:cNvPr id="0" name="image1.jpg"/>
-                    <pic:cNvPicPr preferRelativeResize="0"/>
-                  </pic:nvPicPr>
-                  <pic:blipFill>
-                    <a:blip r:embed="rId6"/>
-                    <a:srcRect/>
-                    <a:stretch>
-                      <a:fillRect/>
-                    </a:stretch>
-                  </pic:blipFill>
-                  <pic:spPr>
-                    <a:xfrm>
-                      <a:off x="0" y="0"/>
-                      <a:ext cx="3148013" cy="1796373"/>
-                    </a:xfrm>
-                    <a:prstGeom prst="rect">
-                      <a:avLst/>
-                    </a:prstGeom>
-                    <a:ln/>
-                  </pic:spPr>
-                </pic:pic>
-              </a:graphicData>
-            </a:graphic>
-          </wp:inline>
-        </w:drawing>
-      </w:r>
-    </w:p>
-    <w:p>
-      <w:pPr>
-        <w:jc w:val="center"/>
-      </w:pPr>
-      <w:r>
-        <w:t>Figure X: Flow chart of XXXXXXX</w:t>
-      </w:r>
-    </w:p>
-    <w:p>
-      <w:pPr>
-        <w:jc w:val="center"/>
-      </w:pPr>
-    </w:p>
-    <w:p>
-      <w:r>
-        <w:rPr>
-          <w:lang w:val="en-US"/>
-        </w:rPr>
-        <w:t>"Lorem ipsum dolor sit amet, consectetur adipiscing elit, sed do eiusmod tempor incididunt ut labore et dolore magna aliqua. Ut enim ad minim veniam, quis nostrud exercitation ullamco laboris nisi ut aliquip ex ea commodo consequat. Duis aute irure dolor in reprehenderit in voluptate velit esse cillum dolore eu fugiat nulla pariatur. Excepteur sint occaecat cupidatat non proident, sunt in culpa qui officia deserunt mollit anim id est laborum."</w:t>
-      </w:r>
-    </w:p>
-    <w:p>
-      <w:r>
-        <w:br w:type="page"/>
-      </w:r>
-    </w:p>
-    <w:p/>
-    <w:p>
-      <w:pPr>
-        <w:jc w:val="center"/>
-        <w:rPr>
-          <w:sz w:val="28"/>
-          <w:szCs w:val="28"/>
-        </w:rPr>
-      </w:pPr>
-      <w:r>
-        <w:rPr>
-          <w:sz w:val="28"/>
-          <w:szCs w:val="28"/>
-        </w:rPr>
-        <w:t>UML Class Diagram</w:t>
-      </w:r>
-    </w:p>
-    <w:p>
-      <w:pPr>
-        <w:jc w:val="center"/>
-        <w:rPr>
-          <w:sz w:val="28"/>
-          <w:szCs w:val="28"/>
-        </w:rPr>
-      </w:pPr>
-    </w:p>
-    <w:p>
-      <w:pPr>
-        <w:jc w:val="center"/>
-      </w:pPr>
-      <w:r>
-        <w:rPr>
-          <w:noProof/>
-        </w:rPr>
-        <w:drawing>
-          <wp:inline distT="114300" distB="114300" distL="114300" distR="114300" wp14:anchorId="41ED67EF" wp14:editId="4BB915F6">
-            <wp:extent cx="3148013" cy="1796373"/>
-            <wp:effectExtent l="0" t="0" r="0" b="0"/>
-            <wp:docPr id="1955513105" name="image1.jpg"/>
-            <wp:cNvGraphicFramePr/>
-            <a:graphic xmlns:a="http://schemas.openxmlformats.org/drawingml/2006/main">
-              <a:graphicData uri="http://schemas.openxmlformats.org/drawingml/2006/picture">
-                <pic:pic xmlns:pic="http://schemas.openxmlformats.org/drawingml/2006/picture">
-                  <pic:nvPicPr>
-                    <pic:cNvPr id="0" name="image1.jpg"/>
-                    <pic:cNvPicPr preferRelativeResize="0"/>
-                  </pic:nvPicPr>
-                  <pic:blipFill>
-                    <a:blip r:embed="rId6"/>
-                    <a:srcRect/>
-                    <a:stretch>
-                      <a:fillRect/>
-                    </a:stretch>
-                  </pic:blipFill>
-                  <pic:spPr>
-                    <a:xfrm>
-                      <a:off x="0" y="0"/>
-                      <a:ext cx="3148013" cy="1796373"/>
-                    </a:xfrm>
-                    <a:prstGeom prst="rect">
-                      <a:avLst/>
-                    </a:prstGeom>
-                    <a:ln/>
-                  </pic:spPr>
-                </pic:pic>
-              </a:graphicData>
-            </a:graphic>
-          </wp:inline>
-        </w:drawing>
-      </w:r>
-    </w:p>
-    <w:p>
-      <w:pPr>
-        <w:jc w:val="center"/>
-      </w:pPr>
-      <w:r>
-        <w:t>Figure X: UML Class Diagram</w:t>
-      </w:r>
-    </w:p>
-    <w:p>
-      <w:pPr>
-        <w:jc w:val="center"/>
-      </w:pPr>
-    </w:p>
-    <w:p>
-      <w:r>
-        <w:rPr>
-          <w:lang w:val="en-US"/>
-        </w:rPr>
-        <w:t xml:space="preserve">Lorem ipsum dolor sit amet, consectetur adipiscing elit, sed do eiusmod tempor incididunt ut labore et dolore magna aliqua. </w:t>
-      </w:r>
-      <w:r>
-        <w:t xml:space="preserve">Ut enim ad minim veniam, quis nostrud exercitation ullamco laboris nisi ut aliquip ex ea commodo consequat. </w:t>
-      </w:r>
-      <w:r>
-        <w:rPr>
-          <w:lang w:val="en-US"/>
-        </w:rPr>
-        <w:t>Duis aute irure dolor in reprehenderit in voluptate velit esse cillum dolore eu fugiat nulla pariatur. Excepteur sint occaecat cupidatat non proident, sunt in culpa qui officia deserunt mollit anim id est laborum.</w:t>
-      </w:r>
-    </w:p>
-    <w:p>
-      <w:pPr>
-        <w:jc w:val="center"/>
-      </w:pPr>
-      <w:r>
-        <w:br w:type="page"/>
-      </w:r>
-    </w:p>
-    <w:p>
-      <w:pPr>
-        <w:jc w:val="center"/>
-        <w:rPr>
-          <w:sz w:val="28"/>
-          <w:szCs w:val="28"/>
-        </w:rPr>
-      </w:pPr>
-      <w:r>
-        <w:rPr>
-          <w:sz w:val="28"/>
-          <w:szCs w:val="28"/>
-        </w:rPr>
-        <w:lastRenderedPageBreak/>
         <w:t>Screen Shots</w:t>
       </w:r>
     </w:p>
@@ -2874,7 +2633,6 @@
         <w:rPr>
           <w:noProof/>
         </w:rPr>
-        <w:lastRenderedPageBreak/>
         <w:drawing>
           <wp:inline distT="114300" distB="114300" distL="114300" distR="114300" wp14:anchorId="68C2E703" wp14:editId="1825469E">
             <wp:extent cx="3148013" cy="1796373"/>

</xml_diff>